<commit_message>
feat(paper): publication figures, deep statistical analysis, and economic paradigm shift
</commit_message>
<xml_diff>
--- a/01_Architecture/Remora-Arxiv-Paper.docx
+++ b/01_Architecture/Remora-Arxiv-Paper.docx
@@ -30,6 +30,10 @@
         <w:t>Preprint Target: arXiv (cs.LG / cs.AI / cs.AR) | August 2026</w:t>
         <w:br/>
       </w:r>
+      <w:r>
+        <w:t>Code Repository: https://github.com/corzogac/remora</w:t>
+        <w:br/>
+      </w:r>
     </w:p>
     <w:p>
       <w:pPr>
@@ -52,7 +56,7 @@
         <w:pStyle w:val="Heading1"/>
       </w:pPr>
       <w:r>
-        <w:t>1. Introduction</w:t>
+        <w:t>1. Introduction &amp; The Paradigm Shift</w:t>
       </w:r>
     </w:p>
     <w:p>
@@ -89,11 +93,56 @@
       </w:r>
     </w:p>
     <w:p>
+      <w:r>
+        <w:drawing>
+          <wp:inline xmlns:a="http://schemas.openxmlformats.org/drawingml/2006/main" xmlns:pic="http://schemas.openxmlformats.org/drawingml/2006/picture">
+            <wp:extent cx="5486400" cy="1714500"/>
+            <wp:docPr id="1" name="Picture 1"/>
+            <wp:cNvGraphicFramePr>
+              <a:graphicFrameLocks noChangeAspect="1"/>
+            </wp:cNvGraphicFramePr>
+            <a:graphic>
+              <a:graphicData uri="http://schemas.openxmlformats.org/drawingml/2006/picture">
+                <pic:pic>
+                  <pic:nvPicPr>
+                    <pic:cNvPr id="0" name="fig1_wave_phase_dynamics.png"/>
+                    <pic:cNvPicPr/>
+                  </pic:nvPicPr>
+                  <pic:blipFill>
+                    <a:blip r:embed="rId9"/>
+                    <a:stretch>
+                      <a:fillRect/>
+                    </a:stretch>
+                  </pic:blipFill>
+                  <pic:spPr>
+                    <a:xfrm>
+                      <a:off x="0" y="0"/>
+                      <a:ext cx="5486400" cy="1714500"/>
+                    </a:xfrm>
+                    <a:prstGeom prst="rect"/>
+                  </pic:spPr>
+                </pic:pic>
+              </a:graphicData>
+            </a:graphic>
+          </wp:inline>
+        </w:drawing>
+      </w:r>
+    </w:p>
+    <w:p>
+      <w:r>
+        <w:rPr>
+          <w:i/>
+          <w:sz w:val="19"/>
+        </w:rPr>
+        <w:t>Figure 1: 2D continuous wave field across context sequence (t) and layer depth (τ) across Ground State, Persona Standing Wave, and Dialog Traveling Perturbation.</w:t>
+      </w:r>
+    </w:p>
+    <w:p>
       <w:pPr>
         <w:pStyle w:val="Heading1"/>
       </w:pPr>
       <w:r>
-        <w:t>3. Empirical Benchmarks &amp; Experimental Results</w:t>
+        <w:t>3. Empirical Benchmarks &amp; Performance Indicators</w:t>
       </w:r>
     </w:p>
     <w:p>
@@ -484,7 +533,47 @@
     </w:tbl>
     <w:p>
       <w:r>
-        <w:br/>
+        <w:drawing>
+          <wp:inline xmlns:a="http://schemas.openxmlformats.org/drawingml/2006/main" xmlns:pic="http://schemas.openxmlformats.org/drawingml/2006/picture">
+            <wp:extent cx="5486400" cy="3017520"/>
+            <wp:docPr id="2" name="Picture 2"/>
+            <wp:cNvGraphicFramePr>
+              <a:graphicFrameLocks noChangeAspect="1"/>
+            </wp:cNvGraphicFramePr>
+            <a:graphic>
+              <a:graphicData uri="http://schemas.openxmlformats.org/drawingml/2006/picture">
+                <pic:pic>
+                  <pic:nvPicPr>
+                    <pic:cNvPr id="0" name="fig2_ttft_and_kv_savings.png"/>
+                    <pic:cNvPicPr/>
+                  </pic:nvPicPr>
+                  <pic:blipFill>
+                    <a:blip r:embed="rId10"/>
+                    <a:stretch>
+                      <a:fillRect/>
+                    </a:stretch>
+                  </pic:blipFill>
+                  <pic:spPr>
+                    <a:xfrm>
+                      <a:off x="0" y="0"/>
+                      <a:ext cx="5486400" cy="3017520"/>
+                    </a:xfrm>
+                    <a:prstGeom prst="rect"/>
+                  </pic:spPr>
+                </pic:pic>
+              </a:graphicData>
+            </a:graphic>
+          </wp:inline>
+        </w:drawing>
+      </w:r>
+    </w:p>
+    <w:p>
+      <w:r>
+        <w:rPr>
+          <w:i/>
+          <w:sz w:val="19"/>
+        </w:rPr>
+        <w:t>Figure 2: Time-to-First-Token (TTFT) latency speedup and KV-cache memory elimination scaling with prompt size.</w:t>
       </w:r>
     </w:p>
     <w:p>
@@ -719,22 +808,106 @@
       </w:tr>
     </w:tbl>
     <w:p>
+      <w:r>
+        <w:drawing>
+          <wp:inline xmlns:a="http://schemas.openxmlformats.org/drawingml/2006/main" xmlns:pic="http://schemas.openxmlformats.org/drawingml/2006/picture">
+            <wp:extent cx="5486400" cy="3017520"/>
+            <wp:docPr id="3" name="Picture 3"/>
+            <wp:cNvGraphicFramePr>
+              <a:graphicFrameLocks noChangeAspect="1"/>
+            </wp:cNvGraphicFramePr>
+            <a:graphic>
+              <a:graphicData uri="http://schemas.openxmlformats.org/drawingml/2006/picture">
+                <pic:pic>
+                  <pic:nvPicPr>
+                    <pic:cNvPr id="0" name="fig3_moe_prefetch_accuracy.png"/>
+                    <pic:cNvPicPr/>
+                  </pic:nvPicPr>
+                  <pic:blipFill>
+                    <a:blip r:embed="rId11"/>
+                    <a:stretch>
+                      <a:fillRect/>
+                    </a:stretch>
+                  </pic:blipFill>
+                  <pic:spPr>
+                    <a:xfrm>
+                      <a:off x="0" y="0"/>
+                      <a:ext cx="5486400" cy="3017520"/>
+                    </a:xfrm>
+                    <a:prstGeom prst="rect"/>
+                  </pic:spPr>
+                </pic:pic>
+              </a:graphicData>
+            </a:graphic>
+          </wp:inline>
+        </w:drawing>
+      </w:r>
+    </w:p>
+    <w:p>
+      <w:r>
+        <w:rPr>
+          <w:i/>
+          <w:sz w:val="19"/>
+        </w:rPr>
+        <w:t>Figure 3: MoE predictive prefetching accuracy and NVMe I/O stall elimination across prediction algorithms.</w:t>
+      </w:r>
+    </w:p>
+    <w:p>
       <w:pPr>
         <w:pStyle w:val="Heading1"/>
       </w:pPr>
       <w:r>
-        <w:t>4. Strategic Value &amp; Next Milestones</w:t>
+        <w:t>4. The Economic &amp; GPU Billing Paradigm Shift</w:t>
       </w:r>
     </w:p>
     <w:p>
       <w:r>
-        <w:t>Remora provides a foundation for the next generation of inference engines:</w:t>
-        <w:br/>
-        <w:t>1. Standalone Core: Remora defines a universal C/C++ engine extension applicable to both pure C streaming (Colibri) and hybrid engines (llama.cpp).</w:t>
-        <w:br/>
-        <w:t>2. Zero-Token Agents: Removing the prompt tax transforms edge and cloud deployments, allowing agents to hold complex personas with zero runtime penalty.</w:t>
-        <w:br/>
-        <w:t>3. Scaled Validation on Hugging Face: Testing next on 30B+ MoE architectures using cloud Hugging Face infrastructure.</w:t>
+        <w:t>Historically, GPU compute providers have billed AI inference per 1M Input/Output Tokens. This pricing model exists solely because architectures re-tokenize symbolic text from scratch on every turn. By shifting to continuous latent injections, Remora fundamentally breaks the link between prompt volume and runtime GPU cost. Users pay only for active delta queries, eliminating up to 90% of redundant multi-turn prefill costs.</w:t>
+      </w:r>
+    </w:p>
+    <w:p>
+      <w:r>
+        <w:drawing>
+          <wp:inline xmlns:a="http://schemas.openxmlformats.org/drawingml/2006/main" xmlns:pic="http://schemas.openxmlformats.org/drawingml/2006/picture">
+            <wp:extent cx="5486400" cy="3017520"/>
+            <wp:docPr id="4" name="Picture 4"/>
+            <wp:cNvGraphicFramePr>
+              <a:graphicFrameLocks noChangeAspect="1"/>
+            </wp:cNvGraphicFramePr>
+            <a:graphic>
+              <a:graphicData uri="http://schemas.openxmlformats.org/drawingml/2006/picture">
+                <pic:pic>
+                  <pic:nvPicPr>
+                    <pic:cNvPr id="0" name="fig4_economic_cost_paradigm.png"/>
+                    <pic:cNvPicPr/>
+                  </pic:nvPicPr>
+                  <pic:blipFill>
+                    <a:blip r:embed="rId12"/>
+                    <a:stretch>
+                      <a:fillRect/>
+                    </a:stretch>
+                  </pic:blipFill>
+                  <pic:spPr>
+                    <a:xfrm>
+                      <a:off x="0" y="0"/>
+                      <a:ext cx="5486400" cy="3017520"/>
+                    </a:xfrm>
+                    <a:prstGeom prst="rect"/>
+                  </pic:spPr>
+                </pic:pic>
+              </a:graphicData>
+            </a:graphic>
+          </wp:inline>
+        </w:drawing>
+      </w:r>
+    </w:p>
+    <w:p>
+      <w:r>
+        <w:rPr>
+          <w:i/>
+          <w:sz w:val="19"/>
+        </w:rPr>
+        <w:t>Figure 4: Cumulative multi-turn inference cost comparison demonstrating the decoupling of cost from prompt volume.</w:t>
       </w:r>
     </w:p>
     <w:sectPr>

</xml_diff>